<commit_message>
Sync reviewed BOP exports, report archives and partner permissions
Preserve the current server changes, including POBO certificate templates and calibration, folder ZIP downloads, resumable purchase migrations and USB letter year formatting. Include regression coverage for the reviewed behavior.
</commit_message>
<xml_diff>
--- a/storage/vorlage/projekte/bop/word/Zertifikat_Maske_POBO.docx
+++ b/storage/vorlage/projekte/bop/word/Zertifikat_Maske_POBO.docx
@@ -270,25 +270,99 @@
           <w:sz w:val="24"/>
           <w:szCs w:val="24"/>
         </w:rPr>
-        <w:t xml:space="preserve">       </w:t>
-      </w:r>
-      <w:r>
-        <w:rPr>
-          <w:rFonts w:asciiTheme="minorBidi" w:hAnsiTheme="minorBidi"/>
-          <w:b/>
-          <w:sz w:val="24"/>
-          <w:szCs w:val="24"/>
-        </w:rPr>
-        <w:t xml:space="preserve"> </w:t>
-      </w:r>
-      <w:r>
-        <w:rPr>
-          <w:rFonts w:asciiTheme="minorBidi" w:hAnsiTheme="minorBidi"/>
-          <w:b/>
-          <w:sz w:val="24"/>
-          <w:szCs w:val="24"/>
-        </w:rPr>
-        <w:t xml:space="preserve">    </w:t>
+        <w:t xml:space="preserve">           ${hauswirtschaft}</w:t>
+      </w:r>
+      <w:r>
+        <w:rPr>
+          <w:rFonts w:asciiTheme="minorBidi" w:hAnsiTheme="minorBidi"/>
+          <w:b/>
+          <w:sz w:val="24"/>
+          <w:szCs w:val="24"/>
+        </w:rPr>
+        <w:t xml:space="preserve"/>
+      </w:r>
+      <w:r>
+        <w:rPr>
+          <w:rFonts w:asciiTheme="minorBidi" w:hAnsiTheme="minorBidi"/>
+          <w:b/>
+          <w:sz w:val="24"/>
+          <w:szCs w:val="24"/>
+        </w:rPr>
+        <w:t xml:space="preserve"/>
+      </w:r>
+      <w:r>
+        <w:rPr>
+          <w:rFonts w:asciiTheme="minorBidi" w:hAnsiTheme="minorBidi"/>
+          <w:b/>
+          <w:sz w:val="24"/>
+          <w:szCs w:val="24"/>
+        </w:rPr>
+        <w:t xml:space="preserve"/>
+      </w:r>
+      <w:r>
+        <w:rPr>
+          <w:rFonts w:asciiTheme="minorBidi" w:hAnsiTheme="minorBidi"/>
+          <w:b/>
+          <w:sz w:val="24"/>
+          <w:szCs w:val="24"/>
+        </w:rPr>
+        <w:t xml:space="preserve"/>
+      </w:r>
+      <w:r>
+        <w:rPr>
+          <w:rFonts w:asciiTheme="minorBidi" w:hAnsiTheme="minorBidi"/>
+          <w:b/>
+          <w:sz w:val="24"/>
+          <w:szCs w:val="24"/>
+        </w:rPr>
+        <w:t xml:space="preserve"/>
+      </w:r>
+      <w:r>
+        <w:rPr>
+          <w:rFonts w:asciiTheme="minorBidi" w:hAnsiTheme="minorBidi"/>
+          <w:b/>
+          <w:sz w:val="24"/>
+          <w:szCs w:val="24"/>
+        </w:rPr>
+        <w:t xml:space="preserve"/>
+      </w:r>
+      <w:r>
+        <w:rPr>
+          <w:rFonts w:asciiTheme="minorBidi" w:hAnsiTheme="minorBidi"/>
+          <w:b/>
+          <w:sz w:val="24"/>
+          <w:szCs w:val="24"/>
+        </w:rPr>
+        <w:t xml:space="preserve"/>
+      </w:r>
+      <w:r>
+        <w:rPr>
+          <w:rFonts w:asciiTheme="minorBidi" w:hAnsiTheme="minorBidi"/>
+          <w:b/>
+          <w:sz w:val="26"/>
+          <w:szCs w:val="26"/>
+        </w:rPr>
+        <w:t/>
+      </w:r>
+      <w:proofErr w:type="spellStart"/>
+      <w:r>
+        <w:rPr>
+          <w:rFonts w:asciiTheme="minorBidi" w:hAnsiTheme="minorBidi"/>
+          <w:b/>
+          <w:sz w:val="26"/>
+          <w:szCs w:val="26"/>
+        </w:rPr>
+        <w:t/>
+      </w:r>
+      <w:proofErr w:type="spellEnd"/>
+      <w:r>
+        <w:rPr>
+          <w:rFonts w:asciiTheme="minorBidi" w:hAnsiTheme="minorBidi"/>
+          <w:b/>
+          <w:sz w:val="26"/>
+          <w:szCs w:val="26"/>
+        </w:rPr>
+        <w:t/>
       </w:r>
     </w:p>
     <w:p>
@@ -318,79 +392,79 @@
           <w:sz w:val="24"/>
           <w:szCs w:val="24"/>
         </w:rPr>
-        <w:t xml:space="preserve"> </w:t>
-      </w:r>
-      <w:r>
-        <w:rPr>
-          <w:rFonts w:asciiTheme="minorBidi" w:hAnsiTheme="minorBidi"/>
-          <w:b/>
-          <w:sz w:val="24"/>
-          <w:szCs w:val="24"/>
-        </w:rPr>
-        <w:t xml:space="preserve"> </w:t>
-      </w:r>
-      <w:r>
-        <w:rPr>
-          <w:rFonts w:asciiTheme="minorBidi" w:hAnsiTheme="minorBidi"/>
-          <w:b/>
-          <w:sz w:val="24"/>
-          <w:szCs w:val="24"/>
-        </w:rPr>
-        <w:t xml:space="preserve"> </w:t>
-      </w:r>
-      <w:r>
-        <w:rPr>
-          <w:rFonts w:asciiTheme="minorBidi" w:hAnsiTheme="minorBidi"/>
-          <w:b/>
-          <w:sz w:val="24"/>
-          <w:szCs w:val="24"/>
-        </w:rPr>
-        <w:t xml:space="preserve"> </w:t>
-      </w:r>
-      <w:r>
-        <w:rPr>
-          <w:rFonts w:asciiTheme="minorBidi" w:hAnsiTheme="minorBidi"/>
-          <w:b/>
-          <w:sz w:val="24"/>
-          <w:szCs w:val="24"/>
-        </w:rPr>
-        <w:t xml:space="preserve">  </w:t>
-      </w:r>
-      <w:r>
-        <w:rPr>
-          <w:rFonts w:asciiTheme="minorBidi" w:hAnsiTheme="minorBidi"/>
-          <w:b/>
-          <w:sz w:val="24"/>
-          <w:szCs w:val="24"/>
-        </w:rPr>
-        <w:t xml:space="preserve">  </w:t>
-      </w:r>
-      <w:r>
-        <w:rPr>
-          <w:rFonts w:asciiTheme="minorBidi" w:hAnsiTheme="minorBidi"/>
-          <w:b/>
-          <w:sz w:val="24"/>
-          <w:szCs w:val="24"/>
-        </w:rPr>
-        <w:t xml:space="preserve"> </w:t>
-      </w:r>
-      <w:r>
-        <w:rPr>
-          <w:rFonts w:asciiTheme="minorBidi" w:hAnsiTheme="minorBidi"/>
-          <w:b/>
-          <w:sz w:val="24"/>
-          <w:szCs w:val="24"/>
-        </w:rPr>
-        <w:t xml:space="preserve">  </w:t>
-      </w:r>
-      <w:r>
-        <w:rPr>
-          <w:rFonts w:asciiTheme="minorBidi" w:hAnsiTheme="minorBidi"/>
-          <w:b/>
-          <w:sz w:val="26"/>
-          <w:szCs w:val="26"/>
-        </w:rPr>
-        <w:t>${</w:t>
+        <w:t xml:space="preserve">           ${metall}</w:t>
+      </w:r>
+      <w:r>
+        <w:rPr>
+          <w:rFonts w:asciiTheme="minorBidi" w:hAnsiTheme="minorBidi"/>
+          <w:b/>
+          <w:sz w:val="24"/>
+          <w:szCs w:val="24"/>
+        </w:rPr>
+        <w:t xml:space="preserve"/>
+      </w:r>
+      <w:r>
+        <w:rPr>
+          <w:rFonts w:asciiTheme="minorBidi" w:hAnsiTheme="minorBidi"/>
+          <w:b/>
+          <w:sz w:val="24"/>
+          <w:szCs w:val="24"/>
+        </w:rPr>
+        <w:t xml:space="preserve"/>
+      </w:r>
+      <w:r>
+        <w:rPr>
+          <w:rFonts w:asciiTheme="minorBidi" w:hAnsiTheme="minorBidi"/>
+          <w:b/>
+          <w:sz w:val="24"/>
+          <w:szCs w:val="24"/>
+        </w:rPr>
+        <w:t xml:space="preserve"/>
+      </w:r>
+      <w:r>
+        <w:rPr>
+          <w:rFonts w:asciiTheme="minorBidi" w:hAnsiTheme="minorBidi"/>
+          <w:b/>
+          <w:sz w:val="24"/>
+          <w:szCs w:val="24"/>
+        </w:rPr>
+        <w:t xml:space="preserve"/>
+      </w:r>
+      <w:r>
+        <w:rPr>
+          <w:rFonts w:asciiTheme="minorBidi" w:hAnsiTheme="minorBidi"/>
+          <w:b/>
+          <w:sz w:val="24"/>
+          <w:szCs w:val="24"/>
+        </w:rPr>
+        <w:t xml:space="preserve"/>
+      </w:r>
+      <w:r>
+        <w:rPr>
+          <w:rFonts w:asciiTheme="minorBidi" w:hAnsiTheme="minorBidi"/>
+          <w:b/>
+          <w:sz w:val="24"/>
+          <w:szCs w:val="24"/>
+        </w:rPr>
+        <w:t xml:space="preserve"/>
+      </w:r>
+      <w:r>
+        <w:rPr>
+          <w:rFonts w:asciiTheme="minorBidi" w:hAnsiTheme="minorBidi"/>
+          <w:b/>
+          <w:sz w:val="24"/>
+          <w:szCs w:val="24"/>
+        </w:rPr>
+        <w:t xml:space="preserve"/>
+      </w:r>
+      <w:r>
+        <w:rPr>
+          <w:rFonts w:asciiTheme="minorBidi" w:hAnsiTheme="minorBidi"/>
+          <w:b/>
+          <w:sz w:val="26"/>
+          <w:szCs w:val="26"/>
+        </w:rPr>
+        <w:t/>
       </w:r>
       <w:proofErr w:type="spellStart"/>
       <w:r>
@@ -400,7 +474,7 @@
           <w:sz w:val="26"/>
           <w:szCs w:val="26"/>
         </w:rPr>
-        <w:t>hauswirtschaft</w:t>
+        <w:t/>
       </w:r>
       <w:proofErr w:type="spellEnd"/>
       <w:r>
@@ -410,7 +484,7 @@
           <w:sz w:val="26"/>
           <w:szCs w:val="26"/>
         </w:rPr>
-        <w:t>}</w:t>
+        <w:t/>
       </w:r>
     </w:p>
     <w:p>
@@ -434,70 +508,70 @@
           <w:sz w:val="24"/>
           <w:szCs w:val="24"/>
         </w:rPr>
-        <w:t xml:space="preserve">  </w:t>
-      </w:r>
-      <w:r>
-        <w:rPr>
-          <w:rFonts w:asciiTheme="minorBidi" w:hAnsiTheme="minorBidi"/>
-          <w:b/>
-          <w:sz w:val="24"/>
-          <w:szCs w:val="24"/>
-        </w:rPr>
-        <w:t xml:space="preserve"> </w:t>
-      </w:r>
-      <w:r>
-        <w:rPr>
-          <w:rFonts w:asciiTheme="minorBidi" w:hAnsiTheme="minorBidi"/>
-          <w:b/>
-          <w:sz w:val="24"/>
-          <w:szCs w:val="24"/>
-        </w:rPr>
-        <w:t xml:space="preserve">    </w:t>
-      </w:r>
-      <w:r>
-        <w:rPr>
-          <w:rFonts w:asciiTheme="minorBidi" w:hAnsiTheme="minorBidi"/>
-          <w:b/>
-          <w:sz w:val="24"/>
-          <w:szCs w:val="24"/>
-        </w:rPr>
-        <w:t xml:space="preserve"> </w:t>
-      </w:r>
-      <w:r>
-        <w:rPr>
-          <w:rFonts w:asciiTheme="minorBidi" w:hAnsiTheme="minorBidi"/>
-          <w:b/>
-          <w:sz w:val="24"/>
-          <w:szCs w:val="24"/>
-        </w:rPr>
-        <w:t xml:space="preserve"> </w:t>
-      </w:r>
-      <w:r>
-        <w:rPr>
-          <w:rFonts w:asciiTheme="minorBidi" w:hAnsiTheme="minorBidi"/>
-          <w:b/>
-          <w:sz w:val="24"/>
-          <w:szCs w:val="24"/>
-        </w:rPr>
-        <w:t xml:space="preserve"> </w:t>
-      </w:r>
-      <w:r>
-        <w:rPr>
-          <w:rFonts w:asciiTheme="minorBidi" w:hAnsiTheme="minorBidi"/>
-          <w:b/>
-          <w:sz w:val="24"/>
-          <w:szCs w:val="24"/>
-        </w:rPr>
-        <w:t xml:space="preserve"> </w:t>
-      </w:r>
-      <w:r>
-        <w:rPr>
-          <w:rFonts w:asciiTheme="minorBidi" w:hAnsiTheme="minorBidi"/>
-          <w:b/>
-          <w:sz w:val="26"/>
-          <w:szCs w:val="26"/>
-        </w:rPr>
-        <w:t>${</w:t>
+        <w:t xml:space="preserve">           ${holz}</w:t>
+      </w:r>
+      <w:r>
+        <w:rPr>
+          <w:rFonts w:asciiTheme="minorBidi" w:hAnsiTheme="minorBidi"/>
+          <w:b/>
+          <w:sz w:val="24"/>
+          <w:szCs w:val="24"/>
+        </w:rPr>
+        <w:t xml:space="preserve"/>
+      </w:r>
+      <w:r>
+        <w:rPr>
+          <w:rFonts w:asciiTheme="minorBidi" w:hAnsiTheme="minorBidi"/>
+          <w:b/>
+          <w:sz w:val="24"/>
+          <w:szCs w:val="24"/>
+        </w:rPr>
+        <w:t xml:space="preserve"/>
+      </w:r>
+      <w:r>
+        <w:rPr>
+          <w:rFonts w:asciiTheme="minorBidi" w:hAnsiTheme="minorBidi"/>
+          <w:b/>
+          <w:sz w:val="24"/>
+          <w:szCs w:val="24"/>
+        </w:rPr>
+        <w:t xml:space="preserve"/>
+      </w:r>
+      <w:r>
+        <w:rPr>
+          <w:rFonts w:asciiTheme="minorBidi" w:hAnsiTheme="minorBidi"/>
+          <w:b/>
+          <w:sz w:val="24"/>
+          <w:szCs w:val="24"/>
+        </w:rPr>
+        <w:t xml:space="preserve"/>
+      </w:r>
+      <w:r>
+        <w:rPr>
+          <w:rFonts w:asciiTheme="minorBidi" w:hAnsiTheme="minorBidi"/>
+          <w:b/>
+          <w:sz w:val="24"/>
+          <w:szCs w:val="24"/>
+        </w:rPr>
+        <w:t xml:space="preserve"/>
+      </w:r>
+      <w:r>
+        <w:rPr>
+          <w:rFonts w:asciiTheme="minorBidi" w:hAnsiTheme="minorBidi"/>
+          <w:b/>
+          <w:sz w:val="24"/>
+          <w:szCs w:val="24"/>
+        </w:rPr>
+        <w:t xml:space="preserve"/>
+      </w:r>
+      <w:r>
+        <w:rPr>
+          <w:rFonts w:asciiTheme="minorBidi" w:hAnsiTheme="minorBidi"/>
+          <w:b/>
+          <w:sz w:val="26"/>
+          <w:szCs w:val="26"/>
+        </w:rPr>
+        <w:t/>
       </w:r>
       <w:proofErr w:type="spellStart"/>
       <w:r>
@@ -507,7 +581,7 @@
           <w:sz w:val="26"/>
           <w:szCs w:val="26"/>
         </w:rPr>
-        <w:t>metall</w:t>
+        <w:t/>
       </w:r>
       <w:proofErr w:type="spellEnd"/>
       <w:r>
@@ -517,7 +591,7 @@
           <w:sz w:val="26"/>
           <w:szCs w:val="26"/>
         </w:rPr>
-        <w:t>}</w:t>
+        <w:t/>
       </w:r>
     </w:p>
     <w:p>
@@ -541,52 +615,52 @@
           <w:sz w:val="24"/>
           <w:szCs w:val="24"/>
         </w:rPr>
-        <w:t xml:space="preserve">     </w:t>
-      </w:r>
-      <w:r>
-        <w:rPr>
-          <w:rFonts w:asciiTheme="minorBidi" w:hAnsiTheme="minorBidi"/>
-          <w:b/>
-          <w:sz w:val="24"/>
-          <w:szCs w:val="24"/>
-        </w:rPr>
-        <w:t xml:space="preserve"> </w:t>
-      </w:r>
-      <w:r>
-        <w:rPr>
-          <w:rFonts w:asciiTheme="minorBidi" w:hAnsiTheme="minorBidi"/>
-          <w:b/>
-          <w:sz w:val="24"/>
-          <w:szCs w:val="24"/>
-        </w:rPr>
-        <w:t xml:space="preserve"> </w:t>
-      </w:r>
-      <w:r>
-        <w:rPr>
-          <w:rFonts w:asciiTheme="minorBidi" w:hAnsiTheme="minorBidi"/>
-          <w:b/>
-          <w:sz w:val="24"/>
-          <w:szCs w:val="24"/>
-        </w:rPr>
-        <w:t xml:space="preserve"> </w:t>
-      </w:r>
-      <w:r>
-        <w:rPr>
-          <w:rFonts w:asciiTheme="minorBidi" w:hAnsiTheme="minorBidi"/>
-          <w:b/>
-          <w:sz w:val="24"/>
-          <w:szCs w:val="24"/>
-        </w:rPr>
-        <w:t xml:space="preserve">   </w:t>
-      </w:r>
-      <w:r>
-        <w:rPr>
-          <w:rFonts w:asciiTheme="minorBidi" w:hAnsiTheme="minorBidi"/>
-          <w:b/>
-          <w:sz w:val="26"/>
-          <w:szCs w:val="26"/>
-        </w:rPr>
-        <w:t>${holz}</w:t>
+        <w:t xml:space="preserve">           ${IT}</w:t>
+      </w:r>
+      <w:r>
+        <w:rPr>
+          <w:rFonts w:asciiTheme="minorBidi" w:hAnsiTheme="minorBidi"/>
+          <w:b/>
+          <w:sz w:val="24"/>
+          <w:szCs w:val="24"/>
+        </w:rPr>
+        <w:t xml:space="preserve"/>
+      </w:r>
+      <w:r>
+        <w:rPr>
+          <w:rFonts w:asciiTheme="minorBidi" w:hAnsiTheme="minorBidi"/>
+          <w:b/>
+          <w:sz w:val="24"/>
+          <w:szCs w:val="24"/>
+        </w:rPr>
+        <w:t xml:space="preserve"/>
+      </w:r>
+      <w:r>
+        <w:rPr>
+          <w:rFonts w:asciiTheme="minorBidi" w:hAnsiTheme="minorBidi"/>
+          <w:b/>
+          <w:sz w:val="24"/>
+          <w:szCs w:val="24"/>
+        </w:rPr>
+        <w:t xml:space="preserve"/>
+      </w:r>
+      <w:r>
+        <w:rPr>
+          <w:rFonts w:asciiTheme="minorBidi" w:hAnsiTheme="minorBidi"/>
+          <w:b/>
+          <w:sz w:val="24"/>
+          <w:szCs w:val="24"/>
+        </w:rPr>
+        <w:t xml:space="preserve"/>
+      </w:r>
+      <w:r>
+        <w:rPr>
+          <w:rFonts w:asciiTheme="minorBidi" w:hAnsiTheme="minorBidi"/>
+          <w:b/>
+          <w:sz w:val="26"/>
+          <w:szCs w:val="26"/>
+        </w:rPr>
+        <w:t/>
       </w:r>
     </w:p>
     <w:p>
@@ -610,52 +684,52 @@
           <w:sz w:val="26"/>
           <w:szCs w:val="26"/>
         </w:rPr>
-        <w:t xml:space="preserve">   </w:t>
-      </w:r>
-      <w:r>
-        <w:rPr>
-          <w:rFonts w:asciiTheme="minorBidi" w:hAnsiTheme="minorBidi"/>
-          <w:b/>
-          <w:sz w:val="26"/>
-          <w:szCs w:val="26"/>
-        </w:rPr>
-        <w:t xml:space="preserve"> </w:t>
-      </w:r>
-      <w:r>
-        <w:rPr>
-          <w:rFonts w:asciiTheme="minorBidi" w:hAnsiTheme="minorBidi"/>
-          <w:b/>
-          <w:sz w:val="26"/>
-          <w:szCs w:val="26"/>
-        </w:rPr>
-        <w:t xml:space="preserve"> </w:t>
-      </w:r>
-      <w:r>
-        <w:rPr>
-          <w:rFonts w:asciiTheme="minorBidi" w:hAnsiTheme="minorBidi"/>
-          <w:b/>
-          <w:sz w:val="26"/>
-          <w:szCs w:val="26"/>
-        </w:rPr>
-        <w:t xml:space="preserve"> </w:t>
-      </w:r>
-      <w:r>
-        <w:rPr>
-          <w:rFonts w:asciiTheme="minorBidi" w:hAnsiTheme="minorBidi"/>
-          <w:b/>
-          <w:sz w:val="26"/>
-          <w:szCs w:val="26"/>
-        </w:rPr>
-        <w:t xml:space="preserve">    </w:t>
-      </w:r>
-      <w:r>
-        <w:rPr>
-          <w:rFonts w:asciiTheme="minorBidi" w:hAnsiTheme="minorBidi"/>
-          <w:b/>
-          <w:sz w:val="26"/>
-          <w:szCs w:val="26"/>
-        </w:rPr>
-        <w:t>${IT}</w:t>
+        <w:t xml:space="preserve">          ${verkauf}</w:t>
+      </w:r>
+      <w:r>
+        <w:rPr>
+          <w:rFonts w:asciiTheme="minorBidi" w:hAnsiTheme="minorBidi"/>
+          <w:b/>
+          <w:sz w:val="26"/>
+          <w:szCs w:val="26"/>
+        </w:rPr>
+        <w:t xml:space="preserve"/>
+      </w:r>
+      <w:r>
+        <w:rPr>
+          <w:rFonts w:asciiTheme="minorBidi" w:hAnsiTheme="minorBidi"/>
+          <w:b/>
+          <w:sz w:val="26"/>
+          <w:szCs w:val="26"/>
+        </w:rPr>
+        <w:t xml:space="preserve"/>
+      </w:r>
+      <w:r>
+        <w:rPr>
+          <w:rFonts w:asciiTheme="minorBidi" w:hAnsiTheme="minorBidi"/>
+          <w:b/>
+          <w:sz w:val="26"/>
+          <w:szCs w:val="26"/>
+        </w:rPr>
+        <w:t xml:space="preserve"/>
+      </w:r>
+      <w:r>
+        <w:rPr>
+          <w:rFonts w:asciiTheme="minorBidi" w:hAnsiTheme="minorBidi"/>
+          <w:b/>
+          <w:sz w:val="26"/>
+          <w:szCs w:val="26"/>
+        </w:rPr>
+        <w:t xml:space="preserve"/>
+      </w:r>
+      <w:r>
+        <w:rPr>
+          <w:rFonts w:asciiTheme="minorBidi" w:hAnsiTheme="minorBidi"/>
+          <w:b/>
+          <w:sz w:val="26"/>
+          <w:szCs w:val="26"/>
+        </w:rPr>
+        <w:t/>
       </w:r>
     </w:p>
     <w:p>
@@ -685,61 +759,61 @@
           <w:sz w:val="26"/>
           <w:szCs w:val="26"/>
         </w:rPr>
-        <w:t xml:space="preserve">   </w:t>
-      </w:r>
-      <w:r>
-        <w:rPr>
-          <w:rFonts w:asciiTheme="minorBidi" w:hAnsiTheme="minorBidi"/>
-          <w:b/>
-          <w:sz w:val="26"/>
-          <w:szCs w:val="26"/>
-        </w:rPr>
-        <w:t xml:space="preserve"> </w:t>
-      </w:r>
-      <w:r>
-        <w:rPr>
-          <w:rFonts w:asciiTheme="minorBidi" w:hAnsiTheme="minorBidi"/>
-          <w:b/>
-          <w:sz w:val="26"/>
-          <w:szCs w:val="26"/>
-        </w:rPr>
-        <w:t xml:space="preserve"> </w:t>
-      </w:r>
-      <w:r>
-        <w:rPr>
-          <w:rFonts w:asciiTheme="minorBidi" w:hAnsiTheme="minorBidi"/>
-          <w:b/>
-          <w:sz w:val="26"/>
-          <w:szCs w:val="26"/>
-        </w:rPr>
-        <w:t xml:space="preserve">  </w:t>
-      </w:r>
-      <w:r>
-        <w:rPr>
-          <w:rFonts w:asciiTheme="minorBidi" w:hAnsiTheme="minorBidi"/>
-          <w:b/>
-          <w:sz w:val="26"/>
-          <w:szCs w:val="26"/>
-        </w:rPr>
-        <w:t xml:space="preserve">  </w:t>
-      </w:r>
-      <w:r>
-        <w:rPr>
-          <w:rFonts w:asciiTheme="minorBidi" w:hAnsiTheme="minorBidi"/>
-          <w:b/>
-          <w:sz w:val="26"/>
-          <w:szCs w:val="26"/>
-        </w:rPr>
-        <w:t xml:space="preserve"> </w:t>
-      </w:r>
-      <w:r>
-        <w:rPr>
-          <w:rFonts w:asciiTheme="minorBidi" w:hAnsiTheme="minorBidi"/>
-          <w:b/>
-          <w:sz w:val="26"/>
-          <w:szCs w:val="26"/>
-        </w:rPr>
-        <w:t>${verkauf}</w:t>
+        <w:t xml:space="preserve">          ${kosmetik}</w:t>
+      </w:r>
+      <w:r>
+        <w:rPr>
+          <w:rFonts w:asciiTheme="minorBidi" w:hAnsiTheme="minorBidi"/>
+          <w:b/>
+          <w:sz w:val="26"/>
+          <w:szCs w:val="26"/>
+        </w:rPr>
+        <w:t xml:space="preserve"/>
+      </w:r>
+      <w:r>
+        <w:rPr>
+          <w:rFonts w:asciiTheme="minorBidi" w:hAnsiTheme="minorBidi"/>
+          <w:b/>
+          <w:sz w:val="26"/>
+          <w:szCs w:val="26"/>
+        </w:rPr>
+        <w:t xml:space="preserve"/>
+      </w:r>
+      <w:r>
+        <w:rPr>
+          <w:rFonts w:asciiTheme="minorBidi" w:hAnsiTheme="minorBidi"/>
+          <w:b/>
+          <w:sz w:val="26"/>
+          <w:szCs w:val="26"/>
+        </w:rPr>
+        <w:t xml:space="preserve"/>
+      </w:r>
+      <w:r>
+        <w:rPr>
+          <w:rFonts w:asciiTheme="minorBidi" w:hAnsiTheme="minorBidi"/>
+          <w:b/>
+          <w:sz w:val="26"/>
+          <w:szCs w:val="26"/>
+        </w:rPr>
+        <w:t xml:space="preserve"/>
+      </w:r>
+      <w:r>
+        <w:rPr>
+          <w:rFonts w:asciiTheme="minorBidi" w:hAnsiTheme="minorBidi"/>
+          <w:b/>
+          <w:sz w:val="26"/>
+          <w:szCs w:val="26"/>
+        </w:rPr>
+        <w:t xml:space="preserve"/>
+      </w:r>
+      <w:r>
+        <w:rPr>
+          <w:rFonts w:asciiTheme="minorBidi" w:hAnsiTheme="minorBidi"/>
+          <w:b/>
+          <w:sz w:val="26"/>
+          <w:szCs w:val="26"/>
+        </w:rPr>
+        <w:t/>
       </w:r>
     </w:p>
     <w:p>
@@ -761,79 +835,79 @@
           <w:szCs w:val="26"/>
         </w:rPr>
         <w:tab/>
-        <w:t xml:space="preserve"> </w:t>
-      </w:r>
-      <w:r>
-        <w:rPr>
-          <w:rFonts w:asciiTheme="minorBidi" w:hAnsiTheme="minorBidi"/>
-          <w:b/>
-          <w:sz w:val="26"/>
-          <w:szCs w:val="26"/>
-        </w:rPr>
-        <w:t xml:space="preserve"> </w:t>
-      </w:r>
-      <w:r>
-        <w:rPr>
-          <w:rFonts w:asciiTheme="minorBidi" w:hAnsiTheme="minorBidi"/>
-          <w:b/>
-          <w:sz w:val="26"/>
-          <w:szCs w:val="26"/>
-        </w:rPr>
-        <w:t xml:space="preserve"> </w:t>
-      </w:r>
-      <w:r>
-        <w:rPr>
-          <w:rFonts w:asciiTheme="minorBidi" w:hAnsiTheme="minorBidi"/>
-          <w:b/>
-          <w:sz w:val="26"/>
-          <w:szCs w:val="26"/>
-        </w:rPr>
-        <w:t xml:space="preserve"> </w:t>
-      </w:r>
-      <w:r>
-        <w:rPr>
-          <w:rFonts w:asciiTheme="minorBidi" w:hAnsiTheme="minorBidi"/>
-          <w:b/>
-          <w:sz w:val="26"/>
-          <w:szCs w:val="26"/>
-        </w:rPr>
-        <w:t xml:space="preserve"> </w:t>
-      </w:r>
-      <w:r>
-        <w:rPr>
-          <w:rFonts w:asciiTheme="minorBidi" w:hAnsiTheme="minorBidi"/>
-          <w:b/>
-          <w:sz w:val="26"/>
-          <w:szCs w:val="26"/>
-        </w:rPr>
-        <w:t xml:space="preserve"> </w:t>
-      </w:r>
-      <w:r>
-        <w:rPr>
-          <w:rFonts w:asciiTheme="minorBidi" w:hAnsiTheme="minorBidi"/>
-          <w:b/>
-          <w:sz w:val="26"/>
-          <w:szCs w:val="26"/>
-        </w:rPr>
-        <w:t xml:space="preserve"> </w:t>
-      </w:r>
-      <w:r>
-        <w:rPr>
-          <w:rFonts w:asciiTheme="minorBidi" w:hAnsiTheme="minorBidi"/>
-          <w:b/>
-          <w:sz w:val="26"/>
-          <w:szCs w:val="26"/>
-        </w:rPr>
-        <w:t xml:space="preserve">   </w:t>
-      </w:r>
-      <w:r>
-        <w:rPr>
-          <w:rFonts w:asciiTheme="minorBidi" w:hAnsiTheme="minorBidi"/>
-          <w:b/>
-          <w:sz w:val="26"/>
-          <w:szCs w:val="26"/>
-        </w:rPr>
-        <w:t>${</w:t>
+        <w:t xml:space="preserve">          ${elektro}</w:t>
+      </w:r>
+      <w:r>
+        <w:rPr>
+          <w:rFonts w:asciiTheme="minorBidi" w:hAnsiTheme="minorBidi"/>
+          <w:b/>
+          <w:sz w:val="26"/>
+          <w:szCs w:val="26"/>
+        </w:rPr>
+        <w:t xml:space="preserve"/>
+      </w:r>
+      <w:r>
+        <w:rPr>
+          <w:rFonts w:asciiTheme="minorBidi" w:hAnsiTheme="minorBidi"/>
+          <w:b/>
+          <w:sz w:val="26"/>
+          <w:szCs w:val="26"/>
+        </w:rPr>
+        <w:t xml:space="preserve"/>
+      </w:r>
+      <w:r>
+        <w:rPr>
+          <w:rFonts w:asciiTheme="minorBidi" w:hAnsiTheme="minorBidi"/>
+          <w:b/>
+          <w:sz w:val="26"/>
+          <w:szCs w:val="26"/>
+        </w:rPr>
+        <w:t xml:space="preserve"/>
+      </w:r>
+      <w:r>
+        <w:rPr>
+          <w:rFonts w:asciiTheme="minorBidi" w:hAnsiTheme="minorBidi"/>
+          <w:b/>
+          <w:sz w:val="26"/>
+          <w:szCs w:val="26"/>
+        </w:rPr>
+        <w:t xml:space="preserve"/>
+      </w:r>
+      <w:r>
+        <w:rPr>
+          <w:rFonts w:asciiTheme="minorBidi" w:hAnsiTheme="minorBidi"/>
+          <w:b/>
+          <w:sz w:val="26"/>
+          <w:szCs w:val="26"/>
+        </w:rPr>
+        <w:t xml:space="preserve"/>
+      </w:r>
+      <w:r>
+        <w:rPr>
+          <w:rFonts w:asciiTheme="minorBidi" w:hAnsiTheme="minorBidi"/>
+          <w:b/>
+          <w:sz w:val="26"/>
+          <w:szCs w:val="26"/>
+        </w:rPr>
+        <w:t xml:space="preserve"/>
+      </w:r>
+      <w:r>
+        <w:rPr>
+          <w:rFonts w:asciiTheme="minorBidi" w:hAnsiTheme="minorBidi"/>
+          <w:b/>
+          <w:sz w:val="26"/>
+          <w:szCs w:val="26"/>
+        </w:rPr>
+        <w:t xml:space="preserve"/>
+      </w:r>
+      <w:r>
+        <w:rPr>
+          <w:rFonts w:asciiTheme="minorBidi" w:hAnsiTheme="minorBidi"/>
+          <w:b/>
+          <w:sz w:val="26"/>
+          <w:szCs w:val="26"/>
+        </w:rPr>
+        <w:t/>
       </w:r>
       <w:proofErr w:type="spellStart"/>
       <w:r>
@@ -843,7 +917,7 @@
           <w:sz w:val="26"/>
           <w:szCs w:val="26"/>
         </w:rPr>
-        <w:t>kosmetik</w:t>
+        <w:t/>
       </w:r>
       <w:proofErr w:type="spellEnd"/>
       <w:r>
@@ -853,7 +927,7 @@
           <w:sz w:val="26"/>
           <w:szCs w:val="26"/>
         </w:rPr>
-        <w:t>}</w:t>
+        <w:t/>
       </w:r>
     </w:p>
     <w:p>
@@ -875,16 +949,16 @@
           <w:szCs w:val="26"/>
         </w:rPr>
         <w:tab/>
-        <w:t xml:space="preserve">          </w:t>
-      </w:r>
-      <w:r>
-        <w:rPr>
-          <w:rFonts w:asciiTheme="minorBidi" w:hAnsiTheme="minorBidi"/>
-          <w:b/>
-          <w:sz w:val="26"/>
-          <w:szCs w:val="26"/>
-        </w:rPr>
-        <w:t>${</w:t>
+        <w:t xml:space="preserve">          ${farbe}</w:t>
+      </w:r>
+      <w:r>
+        <w:rPr>
+          <w:rFonts w:asciiTheme="minorBidi" w:hAnsiTheme="minorBidi"/>
+          <w:b/>
+          <w:sz w:val="26"/>
+          <w:szCs w:val="26"/>
+        </w:rPr>
+        <w:t/>
       </w:r>
       <w:proofErr w:type="spellStart"/>
       <w:r>
@@ -894,7 +968,7 @@
           <w:sz w:val="26"/>
           <w:szCs w:val="26"/>
         </w:rPr>
-        <w:t>elektro</w:t>
+        <w:t/>
       </w:r>
       <w:proofErr w:type="spellEnd"/>
       <w:r>
@@ -904,19 +978,20 @@
           <w:sz w:val="26"/>
           <w:szCs w:val="26"/>
         </w:rPr>
-        <w:t>}</w:t>
+        <w:t/>
       </w:r>
       <w:bookmarkStart w:id="0" w:name="_GoBack"/>
       <w:bookmarkEnd w:id="0"/>
     </w:p>
     <w:p>
       <w:pPr>
-        <w:spacing w:after="46"/>
-        <w:rPr>
-          <w:rFonts w:ascii="Rage Italic" w:hAnsi="Rage Italic"/>
-          <w:b/>
-          <w:sz w:val="20"/>
-          <w:szCs w:val="20"/>
+        <w:spacing w:after="40"/>
+        <w:ind w:left="4956"/>
+        <w:rPr>
+          <w:rFonts w:asciiTheme="minorBidi" w:hAnsiTheme="minorBidi"/>
+          <w:b/>
+          <w:sz w:val="26"/>
+          <w:szCs w:val="26"/>
         </w:rPr>
       </w:pPr>
     </w:p>

</xml_diff>